<commit_message>
Replace supplement overview with separate case screenshots
</commit_message>
<xml_diff>
--- a/面向PCB金手指的测试尾板布点布线设计_EDA解析补充修改稿.docx
+++ b/面向PCB金手指的测试尾板布点布线设计_EDA解析补充修改稿.docx
@@ -3239,6 +3239,20 @@
     </w:tbl>
     <w:p/>
     <w:p>
+      <w:pPr>
+        <w:spacing w:lineRule="exact" w:line="400" w:after="120"/>
+        <w:ind w:firstLine="420"/>
+      </w:pPr>
+      <w:r>
+        <w:rPr>
+          <w:b w:val="0"/>
+          <w:sz w:val="24"/>
+          <w:rFonts w:eastAsia="宋体" w:ascii="Times New Roman" w:hAnsi="Times New Roman"/>
+        </w:rPr>
+        <w:t>为避免总览图在论文版面中缩放过小，以下将7个公开EDA案例拆分为独立截图组。每组均包含原始PCB板图、解析覆盖图、规则基线结果和设计算法结果，可作为论文实验截图或答辩材料直接引用。</w:t>
+      </w:r>
+    </w:p>
+    <w:p>
       <w:r>
         <w:br w:type="page"/>
       </w:r>
@@ -3254,49 +3268,1866 @@
           <w:sz w:val="24"/>
           <w:rFonts w:eastAsia="宋体" w:ascii="Times New Roman" w:hAnsi="Times New Roman"/>
         </w:rPr>
-        <w:t>图A-2 公开EDA案例原图、解析覆盖图与算法布线结果</w:t>
+        <w:t>图A-2 pcie test dual ww37案例独立截图对比</w:t>
+      </w:r>
+    </w:p>
+    <w:tbl>
+      <w:tblPr>
+        <w:tblStyle w:val="TableGrid"/>
+        <w:tblW w:type="auto" w:w="0"/>
+        <w:jc w:val="center"/>
+        <w:tblLook w:firstColumn="1" w:firstRow="1" w:lastColumn="0" w:lastRow="0" w:noHBand="0" w:noVBand="1" w:val="04A0"/>
+      </w:tblPr>
+      <w:tblGrid>
+        <w:gridCol w:w="4677"/>
+        <w:gridCol w:w="4677"/>
+      </w:tblGrid>
+      <w:tr>
+        <w:tc>
+          <w:tcPr>
+            <w:tcW w:type="dxa" w:w="4592"/>
+            <w:vAlign w:val="center"/>
+          </w:tcPr>
+          <w:p>
+            <w:pPr>
+              <w:jc w:val="center"/>
+            </w:pPr>
+            <w:r>
+              <w:rPr>
+                <w:b/>
+                <w:sz w:val="19"/>
+                <w:rFonts w:eastAsia="黑体" w:ascii="Times New Roman" w:hAnsi="Times New Roman"/>
+              </w:rPr>
+              <w:t>原始PCB</w:t>
+            </w:r>
+          </w:p>
+          <w:p>
+            <w:pPr>
+              <w:jc w:val="center"/>
+            </w:pPr>
+            <w:r>
+              <w:drawing>
+                <wp:inline xmlns:a="http://schemas.openxmlformats.org/drawingml/2006/main" xmlns:pic="http://schemas.openxmlformats.org/drawingml/2006/picture">
+                  <wp:extent cx="2808000" cy="1986022"/>
+                  <wp:docPr id="2" name="Picture 2"/>
+                  <wp:cNvGraphicFramePr>
+                    <a:graphicFrameLocks noChangeAspect="1"/>
+                  </wp:cNvGraphicFramePr>
+                  <a:graphic>
+                    <a:graphicData uri="http://schemas.openxmlformats.org/drawingml/2006/picture">
+                      <pic:pic>
+                        <pic:nvPicPr>
+                          <pic:cNvPr id="0" name="01_original_pcb.png"/>
+                          <pic:cNvPicPr/>
+                        </pic:nvPicPr>
+                        <pic:blipFill>
+                          <a:blip r:embed="rId10"/>
+                          <a:stretch>
+                            <a:fillRect/>
+                          </a:stretch>
+                        </pic:blipFill>
+                        <pic:spPr>
+                          <a:xfrm>
+                            <a:off x="0" y="0"/>
+                            <a:ext cx="2808000" cy="1986022"/>
+                          </a:xfrm>
+                          <a:prstGeom prst="rect"/>
+                        </pic:spPr>
+                      </pic:pic>
+                    </a:graphicData>
+                  </a:graphic>
+                </wp:inline>
+              </w:drawing>
+            </w:r>
+          </w:p>
+        </w:tc>
+        <w:tc>
+          <w:tcPr>
+            <w:tcW w:type="dxa" w:w="4592"/>
+            <w:vAlign w:val="center"/>
+          </w:tcPr>
+          <w:p>
+            <w:pPr>
+              <w:jc w:val="center"/>
+            </w:pPr>
+            <w:r>
+              <w:rPr>
+                <w:b/>
+                <w:sz w:val="19"/>
+                <w:rFonts w:eastAsia="黑体" w:ascii="Times New Roman" w:hAnsi="Times New Roman"/>
+              </w:rPr>
+              <w:t>解析覆盖</w:t>
+            </w:r>
+          </w:p>
+          <w:p>
+            <w:pPr>
+              <w:jc w:val="center"/>
+            </w:pPr>
+            <w:r>
+              <w:drawing>
+                <wp:inline xmlns:a="http://schemas.openxmlformats.org/drawingml/2006/main" xmlns:pic="http://schemas.openxmlformats.org/drawingml/2006/picture">
+                  <wp:extent cx="2808000" cy="1329971"/>
+                  <wp:docPr id="3" name="Picture 3"/>
+                  <wp:cNvGraphicFramePr>
+                    <a:graphicFrameLocks noChangeAspect="1"/>
+                  </wp:cNvGraphicFramePr>
+                  <a:graphic>
+                    <a:graphicData uri="http://schemas.openxmlformats.org/drawingml/2006/picture">
+                      <pic:pic>
+                        <pic:nvPicPr>
+                          <pic:cNvPr id="0" name="02_parse_overlay.png"/>
+                          <pic:cNvPicPr/>
+                        </pic:nvPicPr>
+                        <pic:blipFill>
+                          <a:blip r:embed="rId11"/>
+                          <a:stretch>
+                            <a:fillRect/>
+                          </a:stretch>
+                        </pic:blipFill>
+                        <pic:spPr>
+                          <a:xfrm>
+                            <a:off x="0" y="0"/>
+                            <a:ext cx="2808000" cy="1329971"/>
+                          </a:xfrm>
+                          <a:prstGeom prst="rect"/>
+                        </pic:spPr>
+                      </pic:pic>
+                    </a:graphicData>
+                  </a:graphic>
+                </wp:inline>
+              </w:drawing>
+            </w:r>
+          </w:p>
+        </w:tc>
+      </w:tr>
+      <w:tr>
+        <w:tc>
+          <w:tcPr>
+            <w:tcW w:type="dxa" w:w="4592"/>
+            <w:vAlign w:val="center"/>
+          </w:tcPr>
+          <w:p>
+            <w:pPr>
+              <w:jc w:val="center"/>
+            </w:pPr>
+            <w:r>
+              <w:rPr>
+                <w:b/>
+                <w:sz w:val="19"/>
+                <w:rFonts w:eastAsia="黑体" w:ascii="Times New Roman" w:hAnsi="Times New Roman"/>
+              </w:rPr>
+              <w:t>规则基线</w:t>
+            </w:r>
+          </w:p>
+          <w:p>
+            <w:pPr>
+              <w:jc w:val="center"/>
+            </w:pPr>
+            <w:r>
+              <w:drawing>
+                <wp:inline xmlns:a="http://schemas.openxmlformats.org/drawingml/2006/main" xmlns:pic="http://schemas.openxmlformats.org/drawingml/2006/picture">
+                  <wp:extent cx="2808000" cy="640735"/>
+                  <wp:docPr id="4" name="Picture 4"/>
+                  <wp:cNvGraphicFramePr>
+                    <a:graphicFrameLocks noChangeAspect="1"/>
+                  </wp:cNvGraphicFramePr>
+                  <a:graphic>
+                    <a:graphicData uri="http://schemas.openxmlformats.org/drawingml/2006/picture">
+                      <pic:pic>
+                        <pic:nvPicPr>
+                          <pic:cNvPr id="0" name="02_baseline_rule.png"/>
+                          <pic:cNvPicPr/>
+                        </pic:nvPicPr>
+                        <pic:blipFill>
+                          <a:blip r:embed="rId12"/>
+                          <a:stretch>
+                            <a:fillRect/>
+                          </a:stretch>
+                        </pic:blipFill>
+                        <pic:spPr>
+                          <a:xfrm>
+                            <a:off x="0" y="0"/>
+                            <a:ext cx="2808000" cy="640735"/>
+                          </a:xfrm>
+                          <a:prstGeom prst="rect"/>
+                        </pic:spPr>
+                      </pic:pic>
+                    </a:graphicData>
+                  </a:graphic>
+                </wp:inline>
+              </w:drawing>
+            </w:r>
+          </w:p>
+        </w:tc>
+        <w:tc>
+          <w:tcPr>
+            <w:tcW w:type="dxa" w:w="4592"/>
+            <w:vAlign w:val="center"/>
+          </w:tcPr>
+          <w:p>
+            <w:pPr>
+              <w:jc w:val="center"/>
+            </w:pPr>
+            <w:r>
+              <w:rPr>
+                <w:b/>
+                <w:sz w:val="19"/>
+                <w:rFonts w:eastAsia="黑体" w:ascii="Times New Roman" w:hAnsi="Times New Roman"/>
+              </w:rPr>
+              <w:t>设计算法</w:t>
+            </w:r>
+          </w:p>
+          <w:p>
+            <w:pPr>
+              <w:jc w:val="center"/>
+            </w:pPr>
+            <w:r>
+              <w:drawing>
+                <wp:inline xmlns:a="http://schemas.openxmlformats.org/drawingml/2006/main" xmlns:pic="http://schemas.openxmlformats.org/drawingml/2006/picture">
+                  <wp:extent cx="2808000" cy="640735"/>
+                  <wp:docPr id="5" name="Picture 5"/>
+                  <wp:cNvGraphicFramePr>
+                    <a:graphicFrameLocks noChangeAspect="1"/>
+                  </wp:cNvGraphicFramePr>
+                  <a:graphic>
+                    <a:graphicData uri="http://schemas.openxmlformats.org/drawingml/2006/picture">
+                      <pic:pic>
+                        <pic:nvPicPr>
+                          <pic:cNvPr id="0" name="03_algorithm_pso_congestion_reroute_astar.png"/>
+                          <pic:cNvPicPr/>
+                        </pic:nvPicPr>
+                        <pic:blipFill>
+                          <a:blip r:embed="rId13"/>
+                          <a:stretch>
+                            <a:fillRect/>
+                          </a:stretch>
+                        </pic:blipFill>
+                        <pic:spPr>
+                          <a:xfrm>
+                            <a:off x="0" y="0"/>
+                            <a:ext cx="2808000" cy="640735"/>
+                          </a:xfrm>
+                          <a:prstGeom prst="rect"/>
+                        </pic:spPr>
+                      </pic:pic>
+                    </a:graphicData>
+                  </a:graphic>
+                </wp:inline>
+              </w:drawing>
+            </w:r>
+          </w:p>
+        </w:tc>
+      </w:tr>
+    </w:tbl>
+    <w:p/>
+    <w:p>
+      <w:r>
+        <w:br w:type="page"/>
       </w:r>
     </w:p>
     <w:p>
       <w:pPr>
-        <w:spacing w:line="240" w:lineRule="auto"/>
+        <w:spacing w:lineRule="exact" w:line="360" w:before="80" w:after="80"/>
         <w:jc w:val="center"/>
       </w:pPr>
       <w:r>
-        <w:drawing>
-          <wp:inline xmlns:a="http://schemas.openxmlformats.org/drawingml/2006/main" xmlns:pic="http://schemas.openxmlformats.org/drawingml/2006/picture">
-            <wp:extent cx="4752000" cy="8328081"/>
-            <wp:docPr id="2" name="Picture 2"/>
-            <wp:cNvGraphicFramePr>
-              <a:graphicFrameLocks noChangeAspect="1"/>
-            </wp:cNvGraphicFramePr>
-            <a:graphic>
-              <a:graphicData uri="http://schemas.openxmlformats.org/drawingml/2006/picture">
-                <pic:pic>
-                  <pic:nvPicPr>
-                    <pic:cNvPr id="0" name="eda_contact_sheet.png"/>
-                    <pic:cNvPicPr/>
-                  </pic:nvPicPr>
-                  <pic:blipFill>
-                    <a:blip r:embed="rId10"/>
-                    <a:stretch>
-                      <a:fillRect/>
-                    </a:stretch>
-                  </pic:blipFill>
-                  <pic:spPr>
-                    <a:xfrm>
-                      <a:off x="0" y="0"/>
-                      <a:ext cx="4752000" cy="8328081"/>
-                    </a:xfrm>
-                    <a:prstGeom prst="rect"/>
-                  </pic:spPr>
-                </pic:pic>
-              </a:graphicData>
-            </a:graphic>
-          </wp:inline>
-        </w:drawing>
+        <w:rPr>
+          <w:b w:val="0"/>
+          <w:sz w:val="24"/>
+          <w:rFonts w:eastAsia="宋体" w:ascii="Times New Roman" w:hAnsi="Times New Roman"/>
+        </w:rPr>
+        <w:t>图A-3 pi5 pcie breakout案例独立截图对比</w:t>
       </w:r>
     </w:p>
+    <w:tbl>
+      <w:tblPr>
+        <w:tblStyle w:val="TableGrid"/>
+        <w:tblW w:type="auto" w:w="0"/>
+        <w:jc w:val="center"/>
+        <w:tblLook w:firstColumn="1" w:firstRow="1" w:lastColumn="0" w:lastRow="0" w:noHBand="0" w:noVBand="1" w:val="04A0"/>
+      </w:tblPr>
+      <w:tblGrid>
+        <w:gridCol w:w="4677"/>
+        <w:gridCol w:w="4677"/>
+      </w:tblGrid>
+      <w:tr>
+        <w:tc>
+          <w:tcPr>
+            <w:tcW w:type="dxa" w:w="4592"/>
+            <w:vAlign w:val="center"/>
+          </w:tcPr>
+          <w:p>
+            <w:pPr>
+              <w:jc w:val="center"/>
+            </w:pPr>
+            <w:r>
+              <w:rPr>
+                <w:b/>
+                <w:sz w:val="19"/>
+                <w:rFonts w:eastAsia="黑体" w:ascii="Times New Roman" w:hAnsi="Times New Roman"/>
+              </w:rPr>
+              <w:t>原始PCB</w:t>
+            </w:r>
+          </w:p>
+          <w:p>
+            <w:pPr>
+              <w:jc w:val="center"/>
+            </w:pPr>
+            <w:r>
+              <w:drawing>
+                <wp:inline xmlns:a="http://schemas.openxmlformats.org/drawingml/2006/main" xmlns:pic="http://schemas.openxmlformats.org/drawingml/2006/picture">
+                  <wp:extent cx="2808000" cy="1986022"/>
+                  <wp:docPr id="6" name="Picture 6"/>
+                  <wp:cNvGraphicFramePr>
+                    <a:graphicFrameLocks noChangeAspect="1"/>
+                  </wp:cNvGraphicFramePr>
+                  <a:graphic>
+                    <a:graphicData uri="http://schemas.openxmlformats.org/drawingml/2006/picture">
+                      <pic:pic>
+                        <pic:nvPicPr>
+                          <pic:cNvPr id="0" name="01_original_pcb.png"/>
+                          <pic:cNvPicPr/>
+                        </pic:nvPicPr>
+                        <pic:blipFill>
+                          <a:blip r:embed="rId14"/>
+                          <a:stretch>
+                            <a:fillRect/>
+                          </a:stretch>
+                        </pic:blipFill>
+                        <pic:spPr>
+                          <a:xfrm>
+                            <a:off x="0" y="0"/>
+                            <a:ext cx="2808000" cy="1986022"/>
+                          </a:xfrm>
+                          <a:prstGeom prst="rect"/>
+                        </pic:spPr>
+                      </pic:pic>
+                    </a:graphicData>
+                  </a:graphic>
+                </wp:inline>
+              </w:drawing>
+            </w:r>
+          </w:p>
+        </w:tc>
+        <w:tc>
+          <w:tcPr>
+            <w:tcW w:type="dxa" w:w="4592"/>
+            <w:vAlign w:val="center"/>
+          </w:tcPr>
+          <w:p>
+            <w:pPr>
+              <w:jc w:val="center"/>
+            </w:pPr>
+            <w:r>
+              <w:rPr>
+                <w:b/>
+                <w:sz w:val="19"/>
+                <w:rFonts w:eastAsia="黑体" w:ascii="Times New Roman" w:hAnsi="Times New Roman"/>
+              </w:rPr>
+              <w:t>解析覆盖</w:t>
+            </w:r>
+          </w:p>
+          <w:p>
+            <w:pPr>
+              <w:jc w:val="center"/>
+            </w:pPr>
+            <w:r>
+              <w:drawing>
+                <wp:inline xmlns:a="http://schemas.openxmlformats.org/drawingml/2006/main" xmlns:pic="http://schemas.openxmlformats.org/drawingml/2006/picture">
+                  <wp:extent cx="2808000" cy="1329971"/>
+                  <wp:docPr id="7" name="Picture 7"/>
+                  <wp:cNvGraphicFramePr>
+                    <a:graphicFrameLocks noChangeAspect="1"/>
+                  </wp:cNvGraphicFramePr>
+                  <a:graphic>
+                    <a:graphicData uri="http://schemas.openxmlformats.org/drawingml/2006/picture">
+                      <pic:pic>
+                        <pic:nvPicPr>
+                          <pic:cNvPr id="0" name="02_parse_overlay.png"/>
+                          <pic:cNvPicPr/>
+                        </pic:nvPicPr>
+                        <pic:blipFill>
+                          <a:blip r:embed="rId15"/>
+                          <a:stretch>
+                            <a:fillRect/>
+                          </a:stretch>
+                        </pic:blipFill>
+                        <pic:spPr>
+                          <a:xfrm>
+                            <a:off x="0" y="0"/>
+                            <a:ext cx="2808000" cy="1329971"/>
+                          </a:xfrm>
+                          <a:prstGeom prst="rect"/>
+                        </pic:spPr>
+                      </pic:pic>
+                    </a:graphicData>
+                  </a:graphic>
+                </wp:inline>
+              </w:drawing>
+            </w:r>
+          </w:p>
+        </w:tc>
+      </w:tr>
+      <w:tr>
+        <w:tc>
+          <w:tcPr>
+            <w:tcW w:type="dxa" w:w="4592"/>
+            <w:vAlign w:val="center"/>
+          </w:tcPr>
+          <w:p>
+            <w:pPr>
+              <w:jc w:val="center"/>
+            </w:pPr>
+            <w:r>
+              <w:rPr>
+                <w:b/>
+                <w:sz w:val="19"/>
+                <w:rFonts w:eastAsia="黑体" w:ascii="Times New Roman" w:hAnsi="Times New Roman"/>
+              </w:rPr>
+              <w:t>规则基线</w:t>
+            </w:r>
+          </w:p>
+          <w:p>
+            <w:pPr>
+              <w:jc w:val="center"/>
+            </w:pPr>
+            <w:r>
+              <w:drawing>
+                <wp:inline xmlns:a="http://schemas.openxmlformats.org/drawingml/2006/main" xmlns:pic="http://schemas.openxmlformats.org/drawingml/2006/picture">
+                  <wp:extent cx="2808000" cy="647116"/>
+                  <wp:docPr id="8" name="Picture 8"/>
+                  <wp:cNvGraphicFramePr>
+                    <a:graphicFrameLocks noChangeAspect="1"/>
+                  </wp:cNvGraphicFramePr>
+                  <a:graphic>
+                    <a:graphicData uri="http://schemas.openxmlformats.org/drawingml/2006/picture">
+                      <pic:pic>
+                        <pic:nvPicPr>
+                          <pic:cNvPr id="0" name="02_baseline_rule.png"/>
+                          <pic:cNvPicPr/>
+                        </pic:nvPicPr>
+                        <pic:blipFill>
+                          <a:blip r:embed="rId16"/>
+                          <a:stretch>
+                            <a:fillRect/>
+                          </a:stretch>
+                        </pic:blipFill>
+                        <pic:spPr>
+                          <a:xfrm>
+                            <a:off x="0" y="0"/>
+                            <a:ext cx="2808000" cy="647116"/>
+                          </a:xfrm>
+                          <a:prstGeom prst="rect"/>
+                        </pic:spPr>
+                      </pic:pic>
+                    </a:graphicData>
+                  </a:graphic>
+                </wp:inline>
+              </w:drawing>
+            </w:r>
+          </w:p>
+        </w:tc>
+        <w:tc>
+          <w:tcPr>
+            <w:tcW w:type="dxa" w:w="4592"/>
+            <w:vAlign w:val="center"/>
+          </w:tcPr>
+          <w:p>
+            <w:pPr>
+              <w:jc w:val="center"/>
+            </w:pPr>
+            <w:r>
+              <w:rPr>
+                <w:b/>
+                <w:sz w:val="19"/>
+                <w:rFonts w:eastAsia="黑体" w:ascii="Times New Roman" w:hAnsi="Times New Roman"/>
+              </w:rPr>
+              <w:t>设计算法</w:t>
+            </w:r>
+          </w:p>
+          <w:p>
+            <w:pPr>
+              <w:jc w:val="center"/>
+            </w:pPr>
+            <w:r>
+              <w:drawing>
+                <wp:inline xmlns:a="http://schemas.openxmlformats.org/drawingml/2006/main" xmlns:pic="http://schemas.openxmlformats.org/drawingml/2006/picture">
+                  <wp:extent cx="2808000" cy="647116"/>
+                  <wp:docPr id="9" name="Picture 9"/>
+                  <wp:cNvGraphicFramePr>
+                    <a:graphicFrameLocks noChangeAspect="1"/>
+                  </wp:cNvGraphicFramePr>
+                  <a:graphic>
+                    <a:graphicData uri="http://schemas.openxmlformats.org/drawingml/2006/picture">
+                      <pic:pic>
+                        <pic:nvPicPr>
+                          <pic:cNvPr id="0" name="03_algorithm_pso_congestion_reroute_astar.png"/>
+                          <pic:cNvPicPr/>
+                        </pic:nvPicPr>
+                        <pic:blipFill>
+                          <a:blip r:embed="rId17"/>
+                          <a:stretch>
+                            <a:fillRect/>
+                          </a:stretch>
+                        </pic:blipFill>
+                        <pic:spPr>
+                          <a:xfrm>
+                            <a:off x="0" y="0"/>
+                            <a:ext cx="2808000" cy="647116"/>
+                          </a:xfrm>
+                          <a:prstGeom prst="rect"/>
+                        </pic:spPr>
+                      </pic:pic>
+                    </a:graphicData>
+                  </a:graphic>
+                </wp:inline>
+              </w:drawing>
+            </w:r>
+          </w:p>
+        </w:tc>
+      </w:tr>
+    </w:tbl>
+    <w:p/>
+    <w:p>
+      <w:r>
+        <w:br w:type="page"/>
+      </w:r>
+    </w:p>
+    <w:p>
+      <w:pPr>
+        <w:spacing w:lineRule="exact" w:line="360" w:before="80" w:after="80"/>
+        <w:jc w:val="center"/>
+      </w:pPr>
+      <w:r>
+        <w:rPr>
+          <w:b w:val="0"/>
+          <w:sz w:val="24"/>
+          <w:rFonts w:eastAsia="宋体" w:ascii="Times New Roman" w:hAnsi="Times New Roman"/>
+        </w:rPr>
+        <w:t>图A-4 pi5 m2 hat案例独立截图对比</w:t>
+      </w:r>
+    </w:p>
+    <w:tbl>
+      <w:tblPr>
+        <w:tblStyle w:val="TableGrid"/>
+        <w:tblW w:type="auto" w:w="0"/>
+        <w:jc w:val="center"/>
+        <w:tblLook w:firstColumn="1" w:firstRow="1" w:lastColumn="0" w:lastRow="0" w:noHBand="0" w:noVBand="1" w:val="04A0"/>
+      </w:tblPr>
+      <w:tblGrid>
+        <w:gridCol w:w="4677"/>
+        <w:gridCol w:w="4677"/>
+      </w:tblGrid>
+      <w:tr>
+        <w:tc>
+          <w:tcPr>
+            <w:tcW w:type="dxa" w:w="4592"/>
+            <w:vAlign w:val="center"/>
+          </w:tcPr>
+          <w:p>
+            <w:pPr>
+              <w:jc w:val="center"/>
+            </w:pPr>
+            <w:r>
+              <w:rPr>
+                <w:b/>
+                <w:sz w:val="19"/>
+                <w:rFonts w:eastAsia="黑体" w:ascii="Times New Roman" w:hAnsi="Times New Roman"/>
+              </w:rPr>
+              <w:t>原始PCB</w:t>
+            </w:r>
+          </w:p>
+          <w:p>
+            <w:pPr>
+              <w:jc w:val="center"/>
+            </w:pPr>
+            <w:r>
+              <w:drawing>
+                <wp:inline xmlns:a="http://schemas.openxmlformats.org/drawingml/2006/main" xmlns:pic="http://schemas.openxmlformats.org/drawingml/2006/picture">
+                  <wp:extent cx="2808000" cy="1986022"/>
+                  <wp:docPr id="10" name="Picture 10"/>
+                  <wp:cNvGraphicFramePr>
+                    <a:graphicFrameLocks noChangeAspect="1"/>
+                  </wp:cNvGraphicFramePr>
+                  <a:graphic>
+                    <a:graphicData uri="http://schemas.openxmlformats.org/drawingml/2006/picture">
+                      <pic:pic>
+                        <pic:nvPicPr>
+                          <pic:cNvPr id="0" name="01_original_pcb.png"/>
+                          <pic:cNvPicPr/>
+                        </pic:nvPicPr>
+                        <pic:blipFill>
+                          <a:blip r:embed="rId18"/>
+                          <a:stretch>
+                            <a:fillRect/>
+                          </a:stretch>
+                        </pic:blipFill>
+                        <pic:spPr>
+                          <a:xfrm>
+                            <a:off x="0" y="0"/>
+                            <a:ext cx="2808000" cy="1986022"/>
+                          </a:xfrm>
+                          <a:prstGeom prst="rect"/>
+                        </pic:spPr>
+                      </pic:pic>
+                    </a:graphicData>
+                  </a:graphic>
+                </wp:inline>
+              </w:drawing>
+            </w:r>
+          </w:p>
+        </w:tc>
+        <w:tc>
+          <w:tcPr>
+            <w:tcW w:type="dxa" w:w="4592"/>
+            <w:vAlign w:val="center"/>
+          </w:tcPr>
+          <w:p>
+            <w:pPr>
+              <w:jc w:val="center"/>
+            </w:pPr>
+            <w:r>
+              <w:rPr>
+                <w:b/>
+                <w:sz w:val="19"/>
+                <w:rFonts w:eastAsia="黑体" w:ascii="Times New Roman" w:hAnsi="Times New Roman"/>
+              </w:rPr>
+              <w:t>解析覆盖</w:t>
+            </w:r>
+          </w:p>
+          <w:p>
+            <w:pPr>
+              <w:jc w:val="center"/>
+            </w:pPr>
+            <w:r>
+              <w:drawing>
+                <wp:inline xmlns:a="http://schemas.openxmlformats.org/drawingml/2006/main" xmlns:pic="http://schemas.openxmlformats.org/drawingml/2006/picture">
+                  <wp:extent cx="2808000" cy="1329971"/>
+                  <wp:docPr id="11" name="Picture 11"/>
+                  <wp:cNvGraphicFramePr>
+                    <a:graphicFrameLocks noChangeAspect="1"/>
+                  </wp:cNvGraphicFramePr>
+                  <a:graphic>
+                    <a:graphicData uri="http://schemas.openxmlformats.org/drawingml/2006/picture">
+                      <pic:pic>
+                        <pic:nvPicPr>
+                          <pic:cNvPr id="0" name="02_parse_overlay.png"/>
+                          <pic:cNvPicPr/>
+                        </pic:nvPicPr>
+                        <pic:blipFill>
+                          <a:blip r:embed="rId19"/>
+                          <a:stretch>
+                            <a:fillRect/>
+                          </a:stretch>
+                        </pic:blipFill>
+                        <pic:spPr>
+                          <a:xfrm>
+                            <a:off x="0" y="0"/>
+                            <a:ext cx="2808000" cy="1329971"/>
+                          </a:xfrm>
+                          <a:prstGeom prst="rect"/>
+                        </pic:spPr>
+                      </pic:pic>
+                    </a:graphicData>
+                  </a:graphic>
+                </wp:inline>
+              </w:drawing>
+            </w:r>
+          </w:p>
+        </w:tc>
+      </w:tr>
+      <w:tr>
+        <w:tc>
+          <w:tcPr>
+            <w:tcW w:type="dxa" w:w="4592"/>
+            <w:vAlign w:val="center"/>
+          </w:tcPr>
+          <w:p>
+            <w:pPr>
+              <w:jc w:val="center"/>
+            </w:pPr>
+            <w:r>
+              <w:rPr>
+                <w:b/>
+                <w:sz w:val="19"/>
+                <w:rFonts w:eastAsia="黑体" w:ascii="Times New Roman" w:hAnsi="Times New Roman"/>
+              </w:rPr>
+              <w:t>规则基线</w:t>
+            </w:r>
+          </w:p>
+          <w:p>
+            <w:pPr>
+              <w:jc w:val="center"/>
+            </w:pPr>
+            <w:r>
+              <w:drawing>
+                <wp:inline xmlns:a="http://schemas.openxmlformats.org/drawingml/2006/main" xmlns:pic="http://schemas.openxmlformats.org/drawingml/2006/picture">
+                  <wp:extent cx="2808000" cy="721473"/>
+                  <wp:docPr id="12" name="Picture 12"/>
+                  <wp:cNvGraphicFramePr>
+                    <a:graphicFrameLocks noChangeAspect="1"/>
+                  </wp:cNvGraphicFramePr>
+                  <a:graphic>
+                    <a:graphicData uri="http://schemas.openxmlformats.org/drawingml/2006/picture">
+                      <pic:pic>
+                        <pic:nvPicPr>
+                          <pic:cNvPr id="0" name="02_baseline_rule.png"/>
+                          <pic:cNvPicPr/>
+                        </pic:nvPicPr>
+                        <pic:blipFill>
+                          <a:blip r:embed="rId20"/>
+                          <a:stretch>
+                            <a:fillRect/>
+                          </a:stretch>
+                        </pic:blipFill>
+                        <pic:spPr>
+                          <a:xfrm>
+                            <a:off x="0" y="0"/>
+                            <a:ext cx="2808000" cy="721473"/>
+                          </a:xfrm>
+                          <a:prstGeom prst="rect"/>
+                        </pic:spPr>
+                      </pic:pic>
+                    </a:graphicData>
+                  </a:graphic>
+                </wp:inline>
+              </w:drawing>
+            </w:r>
+          </w:p>
+        </w:tc>
+        <w:tc>
+          <w:tcPr>
+            <w:tcW w:type="dxa" w:w="4592"/>
+            <w:vAlign w:val="center"/>
+          </w:tcPr>
+          <w:p>
+            <w:pPr>
+              <w:jc w:val="center"/>
+            </w:pPr>
+            <w:r>
+              <w:rPr>
+                <w:b/>
+                <w:sz w:val="19"/>
+                <w:rFonts w:eastAsia="黑体" w:ascii="Times New Roman" w:hAnsi="Times New Roman"/>
+              </w:rPr>
+              <w:t>设计算法</w:t>
+            </w:r>
+          </w:p>
+          <w:p>
+            <w:pPr>
+              <w:jc w:val="center"/>
+            </w:pPr>
+            <w:r>
+              <w:drawing>
+                <wp:inline xmlns:a="http://schemas.openxmlformats.org/drawingml/2006/main" xmlns:pic="http://schemas.openxmlformats.org/drawingml/2006/picture">
+                  <wp:extent cx="2808000" cy="721473"/>
+                  <wp:docPr id="13" name="Picture 13"/>
+                  <wp:cNvGraphicFramePr>
+                    <a:graphicFrameLocks noChangeAspect="1"/>
+                  </wp:cNvGraphicFramePr>
+                  <a:graphic>
+                    <a:graphicData uri="http://schemas.openxmlformats.org/drawingml/2006/picture">
+                      <pic:pic>
+                        <pic:nvPicPr>
+                          <pic:cNvPr id="0" name="03_algorithm_pso_congestion_reroute_astar.png"/>
+                          <pic:cNvPicPr/>
+                        </pic:nvPicPr>
+                        <pic:blipFill>
+                          <a:blip r:embed="rId21"/>
+                          <a:stretch>
+                            <a:fillRect/>
+                          </a:stretch>
+                        </pic:blipFill>
+                        <pic:spPr>
+                          <a:xfrm>
+                            <a:off x="0" y="0"/>
+                            <a:ext cx="2808000" cy="721473"/>
+                          </a:xfrm>
+                          <a:prstGeom prst="rect"/>
+                        </pic:spPr>
+                      </pic:pic>
+                    </a:graphicData>
+                  </a:graphic>
+                </wp:inline>
+              </w:drawing>
+            </w:r>
+          </w:p>
+        </w:tc>
+      </w:tr>
+    </w:tbl>
+    <w:p/>
+    <w:p>
+      <w:r>
+        <w:br w:type="page"/>
+      </w:r>
+    </w:p>
+    <w:p>
+      <w:pPr>
+        <w:spacing w:lineRule="exact" w:line="360" w:before="80" w:after="80"/>
+        <w:jc w:val="center"/>
+      </w:pPr>
+      <w:r>
+        <w:rPr>
+          <w:b w:val="0"/>
+          <w:sz w:val="24"/>
+          <w:rFonts w:eastAsia="宋体" w:ascii="Times New Roman" w:hAnsi="Times New Roman"/>
+        </w:rPr>
+        <w:t>图A-5 pcie aux signal breakout案例独立截图对比</w:t>
+      </w:r>
+    </w:p>
+    <w:tbl>
+      <w:tblPr>
+        <w:tblStyle w:val="TableGrid"/>
+        <w:tblW w:type="auto" w:w="0"/>
+        <w:jc w:val="center"/>
+        <w:tblLook w:firstColumn="1" w:firstRow="1" w:lastColumn="0" w:lastRow="0" w:noHBand="0" w:noVBand="1" w:val="04A0"/>
+      </w:tblPr>
+      <w:tblGrid>
+        <w:gridCol w:w="4677"/>
+        <w:gridCol w:w="4677"/>
+      </w:tblGrid>
+      <w:tr>
+        <w:tc>
+          <w:tcPr>
+            <w:tcW w:type="dxa" w:w="4592"/>
+            <w:vAlign w:val="center"/>
+          </w:tcPr>
+          <w:p>
+            <w:pPr>
+              <w:jc w:val="center"/>
+            </w:pPr>
+            <w:r>
+              <w:rPr>
+                <w:b/>
+                <w:sz w:val="19"/>
+                <w:rFonts w:eastAsia="黑体" w:ascii="Times New Roman" w:hAnsi="Times New Roman"/>
+              </w:rPr>
+              <w:t>原始PCB</w:t>
+            </w:r>
+          </w:p>
+          <w:p>
+            <w:pPr>
+              <w:jc w:val="center"/>
+            </w:pPr>
+            <w:r>
+              <w:drawing>
+                <wp:inline xmlns:a="http://schemas.openxmlformats.org/drawingml/2006/main" xmlns:pic="http://schemas.openxmlformats.org/drawingml/2006/picture">
+                  <wp:extent cx="2808000" cy="1986022"/>
+                  <wp:docPr id="14" name="Picture 14"/>
+                  <wp:cNvGraphicFramePr>
+                    <a:graphicFrameLocks noChangeAspect="1"/>
+                  </wp:cNvGraphicFramePr>
+                  <a:graphic>
+                    <a:graphicData uri="http://schemas.openxmlformats.org/drawingml/2006/picture">
+                      <pic:pic>
+                        <pic:nvPicPr>
+                          <pic:cNvPr id="0" name="01_original_pcb.png"/>
+                          <pic:cNvPicPr/>
+                        </pic:nvPicPr>
+                        <pic:blipFill>
+                          <a:blip r:embed="rId22"/>
+                          <a:stretch>
+                            <a:fillRect/>
+                          </a:stretch>
+                        </pic:blipFill>
+                        <pic:spPr>
+                          <a:xfrm>
+                            <a:off x="0" y="0"/>
+                            <a:ext cx="2808000" cy="1986022"/>
+                          </a:xfrm>
+                          <a:prstGeom prst="rect"/>
+                        </pic:spPr>
+                      </pic:pic>
+                    </a:graphicData>
+                  </a:graphic>
+                </wp:inline>
+              </w:drawing>
+            </w:r>
+          </w:p>
+        </w:tc>
+        <w:tc>
+          <w:tcPr>
+            <w:tcW w:type="dxa" w:w="4592"/>
+            <w:vAlign w:val="center"/>
+          </w:tcPr>
+          <w:p>
+            <w:pPr>
+              <w:jc w:val="center"/>
+            </w:pPr>
+            <w:r>
+              <w:rPr>
+                <w:b/>
+                <w:sz w:val="19"/>
+                <w:rFonts w:eastAsia="黑体" w:ascii="Times New Roman" w:hAnsi="Times New Roman"/>
+              </w:rPr>
+              <w:t>解析覆盖</w:t>
+            </w:r>
+          </w:p>
+          <w:p>
+            <w:pPr>
+              <w:jc w:val="center"/>
+            </w:pPr>
+            <w:r>
+              <w:drawing>
+                <wp:inline xmlns:a="http://schemas.openxmlformats.org/drawingml/2006/main" xmlns:pic="http://schemas.openxmlformats.org/drawingml/2006/picture">
+                  <wp:extent cx="2808000" cy="1329971"/>
+                  <wp:docPr id="15" name="Picture 15"/>
+                  <wp:cNvGraphicFramePr>
+                    <a:graphicFrameLocks noChangeAspect="1"/>
+                  </wp:cNvGraphicFramePr>
+                  <a:graphic>
+                    <a:graphicData uri="http://schemas.openxmlformats.org/drawingml/2006/picture">
+                      <pic:pic>
+                        <pic:nvPicPr>
+                          <pic:cNvPr id="0" name="02_parse_overlay.png"/>
+                          <pic:cNvPicPr/>
+                        </pic:nvPicPr>
+                        <pic:blipFill>
+                          <a:blip r:embed="rId23"/>
+                          <a:stretch>
+                            <a:fillRect/>
+                          </a:stretch>
+                        </pic:blipFill>
+                        <pic:spPr>
+                          <a:xfrm>
+                            <a:off x="0" y="0"/>
+                            <a:ext cx="2808000" cy="1329971"/>
+                          </a:xfrm>
+                          <a:prstGeom prst="rect"/>
+                        </pic:spPr>
+                      </pic:pic>
+                    </a:graphicData>
+                  </a:graphic>
+                </wp:inline>
+              </w:drawing>
+            </w:r>
+          </w:p>
+        </w:tc>
+      </w:tr>
+      <w:tr>
+        <w:tc>
+          <w:tcPr>
+            <w:tcW w:type="dxa" w:w="4592"/>
+            <w:vAlign w:val="center"/>
+          </w:tcPr>
+          <w:p>
+            <w:pPr>
+              <w:jc w:val="center"/>
+            </w:pPr>
+            <w:r>
+              <w:rPr>
+                <w:b/>
+                <w:sz w:val="19"/>
+                <w:rFonts w:eastAsia="黑体" w:ascii="Times New Roman" w:hAnsi="Times New Roman"/>
+              </w:rPr>
+              <w:t>规则基线</w:t>
+            </w:r>
+          </w:p>
+          <w:p>
+            <w:pPr>
+              <w:jc w:val="center"/>
+            </w:pPr>
+            <w:r>
+              <w:drawing>
+                <wp:inline xmlns:a="http://schemas.openxmlformats.org/drawingml/2006/main" xmlns:pic="http://schemas.openxmlformats.org/drawingml/2006/picture">
+                  <wp:extent cx="2808000" cy="991735"/>
+                  <wp:docPr id="16" name="Picture 16"/>
+                  <wp:cNvGraphicFramePr>
+                    <a:graphicFrameLocks noChangeAspect="1"/>
+                  </wp:cNvGraphicFramePr>
+                  <a:graphic>
+                    <a:graphicData uri="http://schemas.openxmlformats.org/drawingml/2006/picture">
+                      <pic:pic>
+                        <pic:nvPicPr>
+                          <pic:cNvPr id="0" name="02_baseline_rule.png"/>
+                          <pic:cNvPicPr/>
+                        </pic:nvPicPr>
+                        <pic:blipFill>
+                          <a:blip r:embed="rId24"/>
+                          <a:stretch>
+                            <a:fillRect/>
+                          </a:stretch>
+                        </pic:blipFill>
+                        <pic:spPr>
+                          <a:xfrm>
+                            <a:off x="0" y="0"/>
+                            <a:ext cx="2808000" cy="991735"/>
+                          </a:xfrm>
+                          <a:prstGeom prst="rect"/>
+                        </pic:spPr>
+                      </pic:pic>
+                    </a:graphicData>
+                  </a:graphic>
+                </wp:inline>
+              </w:drawing>
+            </w:r>
+          </w:p>
+        </w:tc>
+        <w:tc>
+          <w:tcPr>
+            <w:tcW w:type="dxa" w:w="4592"/>
+            <w:vAlign w:val="center"/>
+          </w:tcPr>
+          <w:p>
+            <w:pPr>
+              <w:jc w:val="center"/>
+            </w:pPr>
+            <w:r>
+              <w:rPr>
+                <w:b/>
+                <w:sz w:val="19"/>
+                <w:rFonts w:eastAsia="黑体" w:ascii="Times New Roman" w:hAnsi="Times New Roman"/>
+              </w:rPr>
+              <w:t>设计算法</w:t>
+            </w:r>
+          </w:p>
+          <w:p>
+            <w:pPr>
+              <w:jc w:val="center"/>
+            </w:pPr>
+            <w:r>
+              <w:drawing>
+                <wp:inline xmlns:a="http://schemas.openxmlformats.org/drawingml/2006/main" xmlns:pic="http://schemas.openxmlformats.org/drawingml/2006/picture">
+                  <wp:extent cx="2808000" cy="991735"/>
+                  <wp:docPr id="17" name="Picture 17"/>
+                  <wp:cNvGraphicFramePr>
+                    <a:graphicFrameLocks noChangeAspect="1"/>
+                  </wp:cNvGraphicFramePr>
+                  <a:graphic>
+                    <a:graphicData uri="http://schemas.openxmlformats.org/drawingml/2006/picture">
+                      <pic:pic>
+                        <pic:nvPicPr>
+                          <pic:cNvPr id="0" name="03_algorithm_pso_congestion_reroute_astar.png"/>
+                          <pic:cNvPicPr/>
+                        </pic:nvPicPr>
+                        <pic:blipFill>
+                          <a:blip r:embed="rId25"/>
+                          <a:stretch>
+                            <a:fillRect/>
+                          </a:stretch>
+                        </pic:blipFill>
+                        <pic:spPr>
+                          <a:xfrm>
+                            <a:off x="0" y="0"/>
+                            <a:ext cx="2808000" cy="991735"/>
+                          </a:xfrm>
+                          <a:prstGeom prst="rect"/>
+                        </pic:spPr>
+                      </pic:pic>
+                    </a:graphicData>
+                  </a:graphic>
+                </wp:inline>
+              </w:drawing>
+            </w:r>
+          </w:p>
+        </w:tc>
+      </w:tr>
+    </w:tbl>
+    <w:p/>
+    <w:p>
+      <w:r>
+        <w:br w:type="page"/>
+      </w:r>
+    </w:p>
+    <w:p>
+      <w:pPr>
+        <w:spacing w:lineRule="exact" w:line="360" w:before="80" w:after="80"/>
+        <w:jc w:val="center"/>
+      </w:pPr>
+      <w:r>
+        <w:rPr>
+          <w:b w:val="0"/>
+          <w:sz w:val="24"/>
+          <w:rFonts w:eastAsia="宋体" w:ascii="Times New Roman" w:hAnsi="Times New Roman"/>
+        </w:rPr>
+        <w:t>图A-6 mini pcie reference案例独立截图对比</w:t>
+      </w:r>
+    </w:p>
+    <w:tbl>
+      <w:tblPr>
+        <w:tblStyle w:val="TableGrid"/>
+        <w:tblW w:type="auto" w:w="0"/>
+        <w:jc w:val="center"/>
+        <w:tblLook w:firstColumn="1" w:firstRow="1" w:lastColumn="0" w:lastRow="0" w:noHBand="0" w:noVBand="1" w:val="04A0"/>
+      </w:tblPr>
+      <w:tblGrid>
+        <w:gridCol w:w="4677"/>
+        <w:gridCol w:w="4677"/>
+      </w:tblGrid>
+      <w:tr>
+        <w:tc>
+          <w:tcPr>
+            <w:tcW w:type="dxa" w:w="4592"/>
+            <w:vAlign w:val="center"/>
+          </w:tcPr>
+          <w:p>
+            <w:pPr>
+              <w:jc w:val="center"/>
+            </w:pPr>
+            <w:r>
+              <w:rPr>
+                <w:b/>
+                <w:sz w:val="19"/>
+                <w:rFonts w:eastAsia="黑体" w:ascii="Times New Roman" w:hAnsi="Times New Roman"/>
+              </w:rPr>
+              <w:t>原始PCB</w:t>
+            </w:r>
+          </w:p>
+          <w:p>
+            <w:pPr>
+              <w:jc w:val="center"/>
+            </w:pPr>
+            <w:r>
+              <w:drawing>
+                <wp:inline xmlns:a="http://schemas.openxmlformats.org/drawingml/2006/main" xmlns:pic="http://schemas.openxmlformats.org/drawingml/2006/picture">
+                  <wp:extent cx="2808000" cy="1986022"/>
+                  <wp:docPr id="18" name="Picture 18"/>
+                  <wp:cNvGraphicFramePr>
+                    <a:graphicFrameLocks noChangeAspect="1"/>
+                  </wp:cNvGraphicFramePr>
+                  <a:graphic>
+                    <a:graphicData uri="http://schemas.openxmlformats.org/drawingml/2006/picture">
+                      <pic:pic>
+                        <pic:nvPicPr>
+                          <pic:cNvPr id="0" name="01_original_pcb.png"/>
+                          <pic:cNvPicPr/>
+                        </pic:nvPicPr>
+                        <pic:blipFill>
+                          <a:blip r:embed="rId26"/>
+                          <a:stretch>
+                            <a:fillRect/>
+                          </a:stretch>
+                        </pic:blipFill>
+                        <pic:spPr>
+                          <a:xfrm>
+                            <a:off x="0" y="0"/>
+                            <a:ext cx="2808000" cy="1986022"/>
+                          </a:xfrm>
+                          <a:prstGeom prst="rect"/>
+                        </pic:spPr>
+                      </pic:pic>
+                    </a:graphicData>
+                  </a:graphic>
+                </wp:inline>
+              </w:drawing>
+            </w:r>
+          </w:p>
+        </w:tc>
+        <w:tc>
+          <w:tcPr>
+            <w:tcW w:type="dxa" w:w="4592"/>
+            <w:vAlign w:val="center"/>
+          </w:tcPr>
+          <w:p>
+            <w:pPr>
+              <w:jc w:val="center"/>
+            </w:pPr>
+            <w:r>
+              <w:rPr>
+                <w:b/>
+                <w:sz w:val="19"/>
+                <w:rFonts w:eastAsia="黑体" w:ascii="Times New Roman" w:hAnsi="Times New Roman"/>
+              </w:rPr>
+              <w:t>解析覆盖</w:t>
+            </w:r>
+          </w:p>
+          <w:p>
+            <w:pPr>
+              <w:jc w:val="center"/>
+            </w:pPr>
+            <w:r>
+              <w:drawing>
+                <wp:inline xmlns:a="http://schemas.openxmlformats.org/drawingml/2006/main" xmlns:pic="http://schemas.openxmlformats.org/drawingml/2006/picture">
+                  <wp:extent cx="2808000" cy="1329971"/>
+                  <wp:docPr id="19" name="Picture 19"/>
+                  <wp:cNvGraphicFramePr>
+                    <a:graphicFrameLocks noChangeAspect="1"/>
+                  </wp:cNvGraphicFramePr>
+                  <a:graphic>
+                    <a:graphicData uri="http://schemas.openxmlformats.org/drawingml/2006/picture">
+                      <pic:pic>
+                        <pic:nvPicPr>
+                          <pic:cNvPr id="0" name="02_parse_overlay.png"/>
+                          <pic:cNvPicPr/>
+                        </pic:nvPicPr>
+                        <pic:blipFill>
+                          <a:blip r:embed="rId27"/>
+                          <a:stretch>
+                            <a:fillRect/>
+                          </a:stretch>
+                        </pic:blipFill>
+                        <pic:spPr>
+                          <a:xfrm>
+                            <a:off x="0" y="0"/>
+                            <a:ext cx="2808000" cy="1329971"/>
+                          </a:xfrm>
+                          <a:prstGeom prst="rect"/>
+                        </pic:spPr>
+                      </pic:pic>
+                    </a:graphicData>
+                  </a:graphic>
+                </wp:inline>
+              </w:drawing>
+            </w:r>
+          </w:p>
+        </w:tc>
+      </w:tr>
+      <w:tr>
+        <w:tc>
+          <w:tcPr>
+            <w:tcW w:type="dxa" w:w="4592"/>
+            <w:vAlign w:val="center"/>
+          </w:tcPr>
+          <w:p>
+            <w:pPr>
+              <w:jc w:val="center"/>
+            </w:pPr>
+            <w:r>
+              <w:rPr>
+                <w:b/>
+                <w:sz w:val="19"/>
+                <w:rFonts w:eastAsia="黑体" w:ascii="Times New Roman" w:hAnsi="Times New Roman"/>
+              </w:rPr>
+              <w:t>规则基线</w:t>
+            </w:r>
+          </w:p>
+          <w:p>
+            <w:pPr>
+              <w:jc w:val="center"/>
+            </w:pPr>
+            <w:r>
+              <w:drawing>
+                <wp:inline xmlns:a="http://schemas.openxmlformats.org/drawingml/2006/main" xmlns:pic="http://schemas.openxmlformats.org/drawingml/2006/picture">
+                  <wp:extent cx="2808000" cy="1988575"/>
+                  <wp:docPr id="20" name="Picture 20"/>
+                  <wp:cNvGraphicFramePr>
+                    <a:graphicFrameLocks noChangeAspect="1"/>
+                  </wp:cNvGraphicFramePr>
+                  <a:graphic>
+                    <a:graphicData uri="http://schemas.openxmlformats.org/drawingml/2006/picture">
+                      <pic:pic>
+                        <pic:nvPicPr>
+                          <pic:cNvPr id="0" name="02_baseline_rule.png"/>
+                          <pic:cNvPicPr/>
+                        </pic:nvPicPr>
+                        <pic:blipFill>
+                          <a:blip r:embed="rId28"/>
+                          <a:stretch>
+                            <a:fillRect/>
+                          </a:stretch>
+                        </pic:blipFill>
+                        <pic:spPr>
+                          <a:xfrm>
+                            <a:off x="0" y="0"/>
+                            <a:ext cx="2808000" cy="1988575"/>
+                          </a:xfrm>
+                          <a:prstGeom prst="rect"/>
+                        </pic:spPr>
+                      </pic:pic>
+                    </a:graphicData>
+                  </a:graphic>
+                </wp:inline>
+              </w:drawing>
+            </w:r>
+          </w:p>
+        </w:tc>
+        <w:tc>
+          <w:tcPr>
+            <w:tcW w:type="dxa" w:w="4592"/>
+            <w:vAlign w:val="center"/>
+          </w:tcPr>
+          <w:p>
+            <w:pPr>
+              <w:jc w:val="center"/>
+            </w:pPr>
+            <w:r>
+              <w:rPr>
+                <w:b/>
+                <w:sz w:val="19"/>
+                <w:rFonts w:eastAsia="黑体" w:ascii="Times New Roman" w:hAnsi="Times New Roman"/>
+              </w:rPr>
+              <w:t>设计算法</w:t>
+            </w:r>
+          </w:p>
+          <w:p>
+            <w:pPr>
+              <w:jc w:val="center"/>
+            </w:pPr>
+            <w:r>
+              <w:drawing>
+                <wp:inline xmlns:a="http://schemas.openxmlformats.org/drawingml/2006/main" xmlns:pic="http://schemas.openxmlformats.org/drawingml/2006/picture">
+                  <wp:extent cx="2808000" cy="1988575"/>
+                  <wp:docPr id="21" name="Picture 21"/>
+                  <wp:cNvGraphicFramePr>
+                    <a:graphicFrameLocks noChangeAspect="1"/>
+                  </wp:cNvGraphicFramePr>
+                  <a:graphic>
+                    <a:graphicData uri="http://schemas.openxmlformats.org/drawingml/2006/picture">
+                      <pic:pic>
+                        <pic:nvPicPr>
+                          <pic:cNvPr id="0" name="03_algorithm_pso_congestion_reroute_astar.png"/>
+                          <pic:cNvPicPr/>
+                        </pic:nvPicPr>
+                        <pic:blipFill>
+                          <a:blip r:embed="rId29"/>
+                          <a:stretch>
+                            <a:fillRect/>
+                          </a:stretch>
+                        </pic:blipFill>
+                        <pic:spPr>
+                          <a:xfrm>
+                            <a:off x="0" y="0"/>
+                            <a:ext cx="2808000" cy="1988575"/>
+                          </a:xfrm>
+                          <a:prstGeom prst="rect"/>
+                        </pic:spPr>
+                      </pic:pic>
+                    </a:graphicData>
+                  </a:graphic>
+                </wp:inline>
+              </w:drawing>
+            </w:r>
+          </w:p>
+        </w:tc>
+      </w:tr>
+    </w:tbl>
+    <w:p/>
+    <w:p>
+      <w:r>
+        <w:br w:type="page"/>
+      </w:r>
+    </w:p>
+    <w:p>
+      <w:pPr>
+        <w:spacing w:lineRule="exact" w:line="360" w:before="80" w:after="80"/>
+        <w:jc w:val="center"/>
+      </w:pPr>
+      <w:r>
+        <w:rPr>
+          <w:b w:val="0"/>
+          <w:sz w:val="24"/>
+          <w:rFonts w:eastAsia="宋体" w:ascii="Times New Roman" w:hAnsi="Times New Roman"/>
+        </w:rPr>
+        <w:t>图A-7 coral dual m2 adapter案例独立截图对比</w:t>
+      </w:r>
+    </w:p>
+    <w:tbl>
+      <w:tblPr>
+        <w:tblStyle w:val="TableGrid"/>
+        <w:tblW w:type="auto" w:w="0"/>
+        <w:jc w:val="center"/>
+        <w:tblLook w:firstColumn="1" w:firstRow="1" w:lastColumn="0" w:lastRow="0" w:noHBand="0" w:noVBand="1" w:val="04A0"/>
+      </w:tblPr>
+      <w:tblGrid>
+        <w:gridCol w:w="4677"/>
+        <w:gridCol w:w="4677"/>
+      </w:tblGrid>
+      <w:tr>
+        <w:tc>
+          <w:tcPr>
+            <w:tcW w:type="dxa" w:w="4592"/>
+            <w:vAlign w:val="center"/>
+          </w:tcPr>
+          <w:p>
+            <w:pPr>
+              <w:jc w:val="center"/>
+            </w:pPr>
+            <w:r>
+              <w:rPr>
+                <w:b/>
+                <w:sz w:val="19"/>
+                <w:rFonts w:eastAsia="黑体" w:ascii="Times New Roman" w:hAnsi="Times New Roman"/>
+              </w:rPr>
+              <w:t>原始PCB</w:t>
+            </w:r>
+          </w:p>
+          <w:p>
+            <w:pPr>
+              <w:jc w:val="center"/>
+            </w:pPr>
+            <w:r>
+              <w:drawing>
+                <wp:inline xmlns:a="http://schemas.openxmlformats.org/drawingml/2006/main" xmlns:pic="http://schemas.openxmlformats.org/drawingml/2006/picture">
+                  <wp:extent cx="2808000" cy="1986022"/>
+                  <wp:docPr id="22" name="Picture 22"/>
+                  <wp:cNvGraphicFramePr>
+                    <a:graphicFrameLocks noChangeAspect="1"/>
+                  </wp:cNvGraphicFramePr>
+                  <a:graphic>
+                    <a:graphicData uri="http://schemas.openxmlformats.org/drawingml/2006/picture">
+                      <pic:pic>
+                        <pic:nvPicPr>
+                          <pic:cNvPr id="0" name="01_original_pcb.png"/>
+                          <pic:cNvPicPr/>
+                        </pic:nvPicPr>
+                        <pic:blipFill>
+                          <a:blip r:embed="rId30"/>
+                          <a:stretch>
+                            <a:fillRect/>
+                          </a:stretch>
+                        </pic:blipFill>
+                        <pic:spPr>
+                          <a:xfrm>
+                            <a:off x="0" y="0"/>
+                            <a:ext cx="2808000" cy="1986022"/>
+                          </a:xfrm>
+                          <a:prstGeom prst="rect"/>
+                        </pic:spPr>
+                      </pic:pic>
+                    </a:graphicData>
+                  </a:graphic>
+                </wp:inline>
+              </w:drawing>
+            </w:r>
+          </w:p>
+        </w:tc>
+        <w:tc>
+          <w:tcPr>
+            <w:tcW w:type="dxa" w:w="4592"/>
+            <w:vAlign w:val="center"/>
+          </w:tcPr>
+          <w:p>
+            <w:pPr>
+              <w:jc w:val="center"/>
+            </w:pPr>
+            <w:r>
+              <w:rPr>
+                <w:b/>
+                <w:sz w:val="19"/>
+                <w:rFonts w:eastAsia="黑体" w:ascii="Times New Roman" w:hAnsi="Times New Roman"/>
+              </w:rPr>
+              <w:t>解析覆盖</w:t>
+            </w:r>
+          </w:p>
+          <w:p>
+            <w:pPr>
+              <w:jc w:val="center"/>
+            </w:pPr>
+            <w:r>
+              <w:drawing>
+                <wp:inline xmlns:a="http://schemas.openxmlformats.org/drawingml/2006/main" xmlns:pic="http://schemas.openxmlformats.org/drawingml/2006/picture">
+                  <wp:extent cx="2808000" cy="1329971"/>
+                  <wp:docPr id="23" name="Picture 23"/>
+                  <wp:cNvGraphicFramePr>
+                    <a:graphicFrameLocks noChangeAspect="1"/>
+                  </wp:cNvGraphicFramePr>
+                  <a:graphic>
+                    <a:graphicData uri="http://schemas.openxmlformats.org/drawingml/2006/picture">
+                      <pic:pic>
+                        <pic:nvPicPr>
+                          <pic:cNvPr id="0" name="02_parse_overlay.png"/>
+                          <pic:cNvPicPr/>
+                        </pic:nvPicPr>
+                        <pic:blipFill>
+                          <a:blip r:embed="rId31"/>
+                          <a:stretch>
+                            <a:fillRect/>
+                          </a:stretch>
+                        </pic:blipFill>
+                        <pic:spPr>
+                          <a:xfrm>
+                            <a:off x="0" y="0"/>
+                            <a:ext cx="2808000" cy="1329971"/>
+                          </a:xfrm>
+                          <a:prstGeom prst="rect"/>
+                        </pic:spPr>
+                      </pic:pic>
+                    </a:graphicData>
+                  </a:graphic>
+                </wp:inline>
+              </w:drawing>
+            </w:r>
+          </w:p>
+        </w:tc>
+      </w:tr>
+      <w:tr>
+        <w:tc>
+          <w:tcPr>
+            <w:tcW w:type="dxa" w:w="4592"/>
+            <w:vAlign w:val="center"/>
+          </w:tcPr>
+          <w:p>
+            <w:pPr>
+              <w:jc w:val="center"/>
+            </w:pPr>
+            <w:r>
+              <w:rPr>
+                <w:b/>
+                <w:sz w:val="19"/>
+                <w:rFonts w:eastAsia="黑体" w:ascii="Times New Roman" w:hAnsi="Times New Roman"/>
+              </w:rPr>
+              <w:t>规则基线</w:t>
+            </w:r>
+          </w:p>
+          <w:p>
+            <w:pPr>
+              <w:jc w:val="center"/>
+            </w:pPr>
+            <w:r>
+              <w:drawing>
+                <wp:inline xmlns:a="http://schemas.openxmlformats.org/drawingml/2006/main" xmlns:pic="http://schemas.openxmlformats.org/drawingml/2006/picture">
+                  <wp:extent cx="2808000" cy="718593"/>
+                  <wp:docPr id="24" name="Picture 24"/>
+                  <wp:cNvGraphicFramePr>
+                    <a:graphicFrameLocks noChangeAspect="1"/>
+                  </wp:cNvGraphicFramePr>
+                  <a:graphic>
+                    <a:graphicData uri="http://schemas.openxmlformats.org/drawingml/2006/picture">
+                      <pic:pic>
+                        <pic:nvPicPr>
+                          <pic:cNvPr id="0" name="02_baseline_rule.png"/>
+                          <pic:cNvPicPr/>
+                        </pic:nvPicPr>
+                        <pic:blipFill>
+                          <a:blip r:embed="rId32"/>
+                          <a:stretch>
+                            <a:fillRect/>
+                          </a:stretch>
+                        </pic:blipFill>
+                        <pic:spPr>
+                          <a:xfrm>
+                            <a:off x="0" y="0"/>
+                            <a:ext cx="2808000" cy="718593"/>
+                          </a:xfrm>
+                          <a:prstGeom prst="rect"/>
+                        </pic:spPr>
+                      </pic:pic>
+                    </a:graphicData>
+                  </a:graphic>
+                </wp:inline>
+              </w:drawing>
+            </w:r>
+          </w:p>
+        </w:tc>
+        <w:tc>
+          <w:tcPr>
+            <w:tcW w:type="dxa" w:w="4592"/>
+            <w:vAlign w:val="center"/>
+          </w:tcPr>
+          <w:p>
+            <w:pPr>
+              <w:jc w:val="center"/>
+            </w:pPr>
+            <w:r>
+              <w:rPr>
+                <w:b/>
+                <w:sz w:val="19"/>
+                <w:rFonts w:eastAsia="黑体" w:ascii="Times New Roman" w:hAnsi="Times New Roman"/>
+              </w:rPr>
+              <w:t>设计算法</w:t>
+            </w:r>
+          </w:p>
+          <w:p>
+            <w:pPr>
+              <w:jc w:val="center"/>
+            </w:pPr>
+            <w:r>
+              <w:drawing>
+                <wp:inline xmlns:a="http://schemas.openxmlformats.org/drawingml/2006/main" xmlns:pic="http://schemas.openxmlformats.org/drawingml/2006/picture">
+                  <wp:extent cx="2808000" cy="718593"/>
+                  <wp:docPr id="25" name="Picture 25"/>
+                  <wp:cNvGraphicFramePr>
+                    <a:graphicFrameLocks noChangeAspect="1"/>
+                  </wp:cNvGraphicFramePr>
+                  <a:graphic>
+                    <a:graphicData uri="http://schemas.openxmlformats.org/drawingml/2006/picture">
+                      <pic:pic>
+                        <pic:nvPicPr>
+                          <pic:cNvPr id="0" name="03_algorithm_pso_congestion_reroute_astar.png"/>
+                          <pic:cNvPicPr/>
+                        </pic:nvPicPr>
+                        <pic:blipFill>
+                          <a:blip r:embed="rId33"/>
+                          <a:stretch>
+                            <a:fillRect/>
+                          </a:stretch>
+                        </pic:blipFill>
+                        <pic:spPr>
+                          <a:xfrm>
+                            <a:off x="0" y="0"/>
+                            <a:ext cx="2808000" cy="718593"/>
+                          </a:xfrm>
+                          <a:prstGeom prst="rect"/>
+                        </pic:spPr>
+                      </pic:pic>
+                    </a:graphicData>
+                  </a:graphic>
+                </wp:inline>
+              </w:drawing>
+            </w:r>
+          </w:p>
+        </w:tc>
+      </w:tr>
+    </w:tbl>
+    <w:p/>
+    <w:p>
+      <w:r>
+        <w:br w:type="page"/>
+      </w:r>
+    </w:p>
+    <w:p>
+      <w:pPr>
+        <w:spacing w:lineRule="exact" w:line="360" w:before="80" w:after="80"/>
+        <w:jc w:val="center"/>
+      </w:pPr>
+      <w:r>
+        <w:rPr>
+          <w:b w:val="0"/>
+          <w:sz w:val="24"/>
+          <w:rFonts w:eastAsia="宋体" w:ascii="Times New Roman" w:hAnsi="Times New Roman"/>
+        </w:rPr>
+        <w:t>图A-8 usb3 ngff carrier案例独立截图对比</w:t>
+      </w:r>
+    </w:p>
+    <w:tbl>
+      <w:tblPr>
+        <w:tblStyle w:val="TableGrid"/>
+        <w:tblW w:type="auto" w:w="0"/>
+        <w:jc w:val="center"/>
+        <w:tblLook w:firstColumn="1" w:firstRow="1" w:lastColumn="0" w:lastRow="0" w:noHBand="0" w:noVBand="1" w:val="04A0"/>
+      </w:tblPr>
+      <w:tblGrid>
+        <w:gridCol w:w="4677"/>
+        <w:gridCol w:w="4677"/>
+      </w:tblGrid>
+      <w:tr>
+        <w:tc>
+          <w:tcPr>
+            <w:tcW w:type="dxa" w:w="4592"/>
+            <w:vAlign w:val="center"/>
+          </w:tcPr>
+          <w:p>
+            <w:pPr>
+              <w:jc w:val="center"/>
+            </w:pPr>
+            <w:r>
+              <w:rPr>
+                <w:b/>
+                <w:sz w:val="19"/>
+                <w:rFonts w:eastAsia="黑体" w:ascii="Times New Roman" w:hAnsi="Times New Roman"/>
+              </w:rPr>
+              <w:t>原始PCB</w:t>
+            </w:r>
+          </w:p>
+          <w:p>
+            <w:pPr>
+              <w:jc w:val="center"/>
+            </w:pPr>
+            <w:r>
+              <w:drawing>
+                <wp:inline xmlns:a="http://schemas.openxmlformats.org/drawingml/2006/main" xmlns:pic="http://schemas.openxmlformats.org/drawingml/2006/picture">
+                  <wp:extent cx="2808000" cy="2169818"/>
+                  <wp:docPr id="26" name="Picture 26"/>
+                  <wp:cNvGraphicFramePr>
+                    <a:graphicFrameLocks noChangeAspect="1"/>
+                  </wp:cNvGraphicFramePr>
+                  <a:graphic>
+                    <a:graphicData uri="http://schemas.openxmlformats.org/drawingml/2006/picture">
+                      <pic:pic>
+                        <pic:nvPicPr>
+                          <pic:cNvPr id="0" name="01_original_pcb.png"/>
+                          <pic:cNvPicPr/>
+                        </pic:nvPicPr>
+                        <pic:blipFill>
+                          <a:blip r:embed="rId34"/>
+                          <a:stretch>
+                            <a:fillRect/>
+                          </a:stretch>
+                        </pic:blipFill>
+                        <pic:spPr>
+                          <a:xfrm>
+                            <a:off x="0" y="0"/>
+                            <a:ext cx="2808000" cy="2169818"/>
+                          </a:xfrm>
+                          <a:prstGeom prst="rect"/>
+                        </pic:spPr>
+                      </pic:pic>
+                    </a:graphicData>
+                  </a:graphic>
+                </wp:inline>
+              </w:drawing>
+            </w:r>
+          </w:p>
+        </w:tc>
+        <w:tc>
+          <w:tcPr>
+            <w:tcW w:type="dxa" w:w="4592"/>
+            <w:vAlign w:val="center"/>
+          </w:tcPr>
+          <w:p>
+            <w:pPr>
+              <w:jc w:val="center"/>
+            </w:pPr>
+            <w:r>
+              <w:rPr>
+                <w:b/>
+                <w:sz w:val="19"/>
+                <w:rFonts w:eastAsia="黑体" w:ascii="Times New Roman" w:hAnsi="Times New Roman"/>
+              </w:rPr>
+              <w:t>解析覆盖</w:t>
+            </w:r>
+          </w:p>
+          <w:p>
+            <w:pPr>
+              <w:jc w:val="center"/>
+            </w:pPr>
+            <w:r>
+              <w:drawing>
+                <wp:inline xmlns:a="http://schemas.openxmlformats.org/drawingml/2006/main" xmlns:pic="http://schemas.openxmlformats.org/drawingml/2006/picture">
+                  <wp:extent cx="2808000" cy="1329971"/>
+                  <wp:docPr id="27" name="Picture 27"/>
+                  <wp:cNvGraphicFramePr>
+                    <a:graphicFrameLocks noChangeAspect="1"/>
+                  </wp:cNvGraphicFramePr>
+                  <a:graphic>
+                    <a:graphicData uri="http://schemas.openxmlformats.org/drawingml/2006/picture">
+                      <pic:pic>
+                        <pic:nvPicPr>
+                          <pic:cNvPr id="0" name="02_parse_overlay.png"/>
+                          <pic:cNvPicPr/>
+                        </pic:nvPicPr>
+                        <pic:blipFill>
+                          <a:blip r:embed="rId35"/>
+                          <a:stretch>
+                            <a:fillRect/>
+                          </a:stretch>
+                        </pic:blipFill>
+                        <pic:spPr>
+                          <a:xfrm>
+                            <a:off x="0" y="0"/>
+                            <a:ext cx="2808000" cy="1329971"/>
+                          </a:xfrm>
+                          <a:prstGeom prst="rect"/>
+                        </pic:spPr>
+                      </pic:pic>
+                    </a:graphicData>
+                  </a:graphic>
+                </wp:inline>
+              </w:drawing>
+            </w:r>
+          </w:p>
+        </w:tc>
+      </w:tr>
+      <w:tr>
+        <w:tc>
+          <w:tcPr>
+            <w:tcW w:type="dxa" w:w="4592"/>
+            <w:vAlign w:val="center"/>
+          </w:tcPr>
+          <w:p>
+            <w:pPr>
+              <w:jc w:val="center"/>
+            </w:pPr>
+            <w:r>
+              <w:rPr>
+                <w:b/>
+                <w:sz w:val="19"/>
+                <w:rFonts w:eastAsia="黑体" w:ascii="Times New Roman" w:hAnsi="Times New Roman"/>
+              </w:rPr>
+              <w:t>规则基线</w:t>
+            </w:r>
+          </w:p>
+          <w:p>
+            <w:pPr>
+              <w:jc w:val="center"/>
+            </w:pPr>
+            <w:r>
+              <w:drawing>
+                <wp:inline xmlns:a="http://schemas.openxmlformats.org/drawingml/2006/main" xmlns:pic="http://schemas.openxmlformats.org/drawingml/2006/picture">
+                  <wp:extent cx="2808000" cy="1393789"/>
+                  <wp:docPr id="28" name="Picture 28"/>
+                  <wp:cNvGraphicFramePr>
+                    <a:graphicFrameLocks noChangeAspect="1"/>
+                  </wp:cNvGraphicFramePr>
+                  <a:graphic>
+                    <a:graphicData uri="http://schemas.openxmlformats.org/drawingml/2006/picture">
+                      <pic:pic>
+                        <pic:nvPicPr>
+                          <pic:cNvPr id="0" name="02_baseline_rule.png"/>
+                          <pic:cNvPicPr/>
+                        </pic:nvPicPr>
+                        <pic:blipFill>
+                          <a:blip r:embed="rId36"/>
+                          <a:stretch>
+                            <a:fillRect/>
+                          </a:stretch>
+                        </pic:blipFill>
+                        <pic:spPr>
+                          <a:xfrm>
+                            <a:off x="0" y="0"/>
+                            <a:ext cx="2808000" cy="1393789"/>
+                          </a:xfrm>
+                          <a:prstGeom prst="rect"/>
+                        </pic:spPr>
+                      </pic:pic>
+                    </a:graphicData>
+                  </a:graphic>
+                </wp:inline>
+              </w:drawing>
+            </w:r>
+          </w:p>
+        </w:tc>
+        <w:tc>
+          <w:tcPr>
+            <w:tcW w:type="dxa" w:w="4592"/>
+            <w:vAlign w:val="center"/>
+          </w:tcPr>
+          <w:p>
+            <w:pPr>
+              <w:jc w:val="center"/>
+            </w:pPr>
+            <w:r>
+              <w:rPr>
+                <w:b/>
+                <w:sz w:val="19"/>
+                <w:rFonts w:eastAsia="黑体" w:ascii="Times New Roman" w:hAnsi="Times New Roman"/>
+              </w:rPr>
+              <w:t>设计算法</w:t>
+            </w:r>
+          </w:p>
+          <w:p>
+            <w:pPr>
+              <w:jc w:val="center"/>
+            </w:pPr>
+            <w:r>
+              <w:drawing>
+                <wp:inline xmlns:a="http://schemas.openxmlformats.org/drawingml/2006/main" xmlns:pic="http://schemas.openxmlformats.org/drawingml/2006/picture">
+                  <wp:extent cx="2808000" cy="1393789"/>
+                  <wp:docPr id="29" name="Picture 29"/>
+                  <wp:cNvGraphicFramePr>
+                    <a:graphicFrameLocks noChangeAspect="1"/>
+                  </wp:cNvGraphicFramePr>
+                  <a:graphic>
+                    <a:graphicData uri="http://schemas.openxmlformats.org/drawingml/2006/picture">
+                      <pic:pic>
+                        <pic:nvPicPr>
+                          <pic:cNvPr id="0" name="03_algorithm_pso_congestion_reroute_astar.png"/>
+                          <pic:cNvPicPr/>
+                        </pic:nvPicPr>
+                        <pic:blipFill>
+                          <a:blip r:embed="rId37"/>
+                          <a:stretch>
+                            <a:fillRect/>
+                          </a:stretch>
+                        </pic:blipFill>
+                        <pic:spPr>
+                          <a:xfrm>
+                            <a:off x="0" y="0"/>
+                            <a:ext cx="2808000" cy="1393789"/>
+                          </a:xfrm>
+                          <a:prstGeom prst="rect"/>
+                        </pic:spPr>
+                      </pic:pic>
+                    </a:graphicData>
+                  </a:graphic>
+                </wp:inline>
+              </w:drawing>
+            </w:r>
+          </w:p>
+        </w:tc>
+      </w:tr>
+    </w:tbl>
+    <w:p/>
     <w:p>
       <w:pPr>
         <w:spacing w:lineRule="exact" w:line="400" w:after="120"/>

</xml_diff>